<commit_message>
Regenerate presales docs for new nav; fix kit tooling
Rebuild the docx/pptx outputs and screenshots for the Ask Cortex first /
Executive Dashboard layout, and fix kit generators that still read the removed
analyst page or the old first-page assumption.

Generated with [Snowflake CoCo](https://docs.snowflake.com/en/user-guide/cortex-code/cortex-code)

Co-authored-by: Snowflake CoCo <noreply@snowflake.com>
</commit_message>
<xml_diff>
--- a/docs/docx/01_Concepts.docx
+++ b/docs/docx/01_Concepts.docx
@@ -2151,7 +2151,25 @@
           <w:i w:val="0"/>
           <w:sz w:val="20"/>
         </w:rPr>
-        <w:t xml:space="preserve">The React application's Cortex Analyst page reads </w:t>
+        <w:t xml:space="preserve">The React application's </w:t>
+      </w:r>
+      <w:r>
+        <w:rPr>
+          <w:rFonts w:ascii="Consolas" w:hAnsi="Consolas"/>
+          <w:b w:val="0"/>
+          <w:i w:val="0"/>
+          <w:color w:val="1B5E8C"/>
+          <w:sz w:val="19"/>
+        </w:rPr>
+        <w:t>/api/analyst</w:t>
+      </w:r>
+      <w:r>
+        <w:rPr>
+          <w:b w:val="0"/>
+          <w:i w:val="0"/>
+          <w:sz w:val="20"/>
+        </w:rPr>
+        <w:t xml:space="preserve"> server route (no longer an in-app page) reads </w:t>
       </w:r>
       <w:r>
         <w:rPr>

</xml_diff>